<commit_message>
v1.3.1: manuscript revision (US spelling, coverage stated with the robust-policy comparison, Sobol estimation documented, title-page sentence removed); no code or result change
Co-Authored-By: Claude Sonnet 5.5 <noreply@anthropic.com>
</commit_message>
<xml_diff>
--- a/manuscript/Cover_Letter_RESS.docx
+++ b/manuscript/Cover_Letter_RESS.docx
@@ -104,7 +104,7 @@
         <w:spacing w:after="120"/>
       </w:pPr>
       <w:r>
-        <w:t>The principal contribution is an analysis of the conditions under which probabilistic decision systems provide reliable clearance recommendations and the conditions under which their assumptions produce unsafe confidence. In particular, the simulations reveal that increased spatial-model complexity can worsen false-clearance outcomes when the assumed utility geometry is incorrect: with a parallel utility and a branch, a sensor-quality-adjusted policy releases 65% of the corridor at 18.0% conditional risk while its own probabilities predict 0.3%, and a simpler one-dimensional model has 1.9%. A policy that releases only if an upper bound over an explicit set of parameters and structures is acceptable holds 0.3% at 36% coverage, at the price of released coverage, and an unflagged sensor failure defeats every policy (65%). The study separates aleatory variability from epistemic uncertainty (epistemic parameter uncertainty accounts for 79 to 88% of the variance of the unsafe-release probability of the quality-adjusted policy), evaluates sensor-fault and common-cause combinations jointly, compares policies at equal released coverage on reliability–coverage curves against calibrated-abstention and oracle baselines, and ranks failure drivers by global sensitivity analysis.</w:t>
+        <w:t>The principal contribution is an analysis of when probabilistic decision systems give reliable clearance recommendations and when their assumptions produce unsafe confidence. In particular, increased spatial-model complexity can worsen false-clearance outcomes when the assumed utility geometry is incorrect, and a robust release rule restores reliability only by releasing less of the corridor. The study separates aleatory variability from epistemic uncertainty, evaluates sensor-fault and common-cause combinations jointly, compares policies at equal released coverage against calibrated-abstention and oracle baselines, and ranks failure drivers by global sensitivity analysis. The key numbers are in the abstract.</w:t>
       </w:r>
     </w:p>
     <w:p>
@@ -112,7 +112,7 @@
         <w:spacing w:after="120"/>
       </w:pPr>
       <w:r>
-        <w:t>We believe the work aligns with the journal’s interests in probabilistic safety assessment, model uncertainty, automatic fault detection and operator decision-support systems. The manuscript explicitly distinguishes simulation-based findings from field-validated performance: the sensor model is assumed, no published detection-versus-depth dataset was reproduced, and the reliability figures are conditional on the simulated environment. Its code, configurations, results and supplementary materials are public and are intended to support independent reproducibility (https://doi.org/10.5281/zenodo.23328500; release v1.3.0 at https://github.com/sandlerleon/subsurface-risk-calibrated-mapping).</w:t>
+        <w:t>We believe the work aligns with the journal’s interests in probabilistic safety assessment, model uncertainty, automatic fault detection and operator decision-support systems. The manuscript explicitly distinguishes simulation-based findings from field-validated performance: the sensor model is assumed, no published detection-versus-depth dataset was reproduced, and the reliability figures are conditional on the simulated environment. Its code, configurations, results and supplementary materials are public and are intended to support independent reproducibility (https://doi.org/10.5281/zenodo.23330176; release v1.3.1 at https://github.com/sandlerleon/subsurface-risk-calibrated-mapping).</w:t>
       </w:r>
     </w:p>
     <w:p>

</xml_diff>